<commit_message>
Update performance results with actual full-budget (28s) benchmarks
J10 (10 sampled, 28s each): 2.7% improvement, 3/9 improved
J20 (10 sampled, 28s each): 5.5% improvement, 9/10 improved, up to 18.5%
Batch (0.2s): J10 3.5%, J20 6.4% — both tested at same time limit

Co-Authored-By: Claude Opus 4.6 (1M context) <noreply@anthropic.com>
</commit_message>
<xml_diff>
--- a/CS202_RCPSP_Report.docx
+++ b/CS202_RCPSP_Report.docx
@@ -1064,7 +1064,7 @@
           </w:tcPr>
           <w:p>
             <w:r>
-              <w:t>Avg makespan (GA, 0.15s)</w:t>
+              <w:t>Avg makespan (GA, 0.2s)</w:t>
             </w:r>
           </w:p>
         </w:tc>
@@ -1160,7 +1160,7 @@
           </w:tcPr>
           <w:p>
             <w:r>
-              <w:t>GA improvement over baseline</w:t>
+              <w:t>GA improvement (0.2s batch)</w:t>
             </w:r>
           </w:p>
         </w:tc>
@@ -1170,7 +1170,7 @@
           </w:tcPr>
           <w:p>
             <w:r>
-              <w:t>3.4%</w:t>
+              <w:t>3.5%</w:t>
             </w:r>
           </w:p>
         </w:tc>
@@ -1436,12 +1436,20 @@
         <w:pStyle w:val="Heading2"/>
       </w:pPr>
       <w:r>
-        <w:t>4.4 GA Performance vs Time Budget</w:t>
+        <w:t>4.4 GA Performance with Full 28s Budget</w:t>
       </w:r>
     </w:p>
     <w:p>
       <w:r>
-        <w:t>We tested the GA with varying time budgets on 5 representative J20 instances:</w:t>
+        <w:t>We tested the GA with the full 28-second time budget on 10 sampled instances from each dataset (J10 and J20):</w:t>
+      </w:r>
+    </w:p>
+    <w:p>
+      <w:pPr>
+        <w:pStyle w:val="Heading3"/>
+      </w:pPr>
+      <w:r>
+        <w:t>J20 Results (28s per instance)</w:t>
       </w:r>
     </w:p>
     <w:tbl>
@@ -1492,7 +1500,7 @@
               <w:rPr>
                 <w:b/>
               </w:rPr>
-              <w:t>GA (0.15s)</w:t>
+              <w:t>GA (28s)</w:t>
             </w:r>
           </w:p>
         </w:tc>
@@ -1505,7 +1513,7 @@
               <w:rPr>
                 <w:b/>
               </w:rPr>
-              <w:t>GA (5s)</w:t>
+              <w:t>Improvement</w:t>
             </w:r>
           </w:p>
         </w:tc>
@@ -1537,7 +1545,7 @@
           </w:tcPr>
           <w:p>
             <w:r>
-              <w:t>51</w:t>
+              <w:t>44</w:t>
             </w:r>
           </w:p>
         </w:tc>
@@ -1547,7 +1555,49 @@
           </w:tcPr>
           <w:p>
             <w:r>
-              <w:t>45</w:t>
+              <w:t>18.5%</w:t>
+            </w:r>
+          </w:p>
+        </w:tc>
+      </w:tr>
+      <w:tr>
+        <w:tc>
+          <w:tcPr>
+            <w:tcW w:type="dxa" w:w="2160"/>
+          </w:tcPr>
+          <w:p>
+            <w:r>
+              <w:t>PSP27</w:t>
+            </w:r>
+          </w:p>
+        </w:tc>
+        <w:tc>
+          <w:tcPr>
+            <w:tcW w:type="dxa" w:w="2160"/>
+          </w:tcPr>
+          <w:p>
+            <w:r>
+              <w:t>38</w:t>
+            </w:r>
+          </w:p>
+        </w:tc>
+        <w:tc>
+          <w:tcPr>
+            <w:tcW w:type="dxa" w:w="2160"/>
+          </w:tcPr>
+          <w:p>
+            <w:r>
+              <w:t>36</w:t>
+            </w:r>
+          </w:p>
+        </w:tc>
+        <w:tc>
+          <w:tcPr>
+            <w:tcW w:type="dxa" w:w="2160"/>
+          </w:tcPr>
+          <w:p>
+            <w:r>
+              <w:t>5.3%</w:t>
             </w:r>
           </w:p>
         </w:tc>
@@ -1579,7 +1629,291 @@
           </w:tcPr>
           <w:p>
             <w:r>
-              <w:t>43</w:t>
+              <w:t>41</w:t>
+            </w:r>
+          </w:p>
+        </w:tc>
+        <w:tc>
+          <w:tcPr>
+            <w:tcW w:type="dxa" w:w="2160"/>
+          </w:tcPr>
+          <w:p>
+            <w:r>
+              <w:t>8.9%</w:t>
+            </w:r>
+          </w:p>
+        </w:tc>
+      </w:tr>
+      <w:tr>
+        <w:tc>
+          <w:tcPr>
+            <w:tcW w:type="dxa" w:w="2160"/>
+          </w:tcPr>
+          <w:p>
+            <w:r>
+              <w:t>PSP75</w:t>
+            </w:r>
+          </w:p>
+        </w:tc>
+        <w:tc>
+          <w:tcPr>
+            <w:tcW w:type="dxa" w:w="2160"/>
+          </w:tcPr>
+          <w:p>
+            <w:r>
+              <w:t>25</w:t>
+            </w:r>
+          </w:p>
+        </w:tc>
+        <w:tc>
+          <w:tcPr>
+            <w:tcW w:type="dxa" w:w="2160"/>
+          </w:tcPr>
+          <w:p>
+            <w:r>
+              <w:t>24</w:t>
+            </w:r>
+          </w:p>
+        </w:tc>
+        <w:tc>
+          <w:tcPr>
+            <w:tcW w:type="dxa" w:w="2160"/>
+          </w:tcPr>
+          <w:p>
+            <w:r>
+              <w:t>4.0%</w:t>
+            </w:r>
+          </w:p>
+        </w:tc>
+      </w:tr>
+      <w:tr>
+        <w:tc>
+          <w:tcPr>
+            <w:tcW w:type="dxa" w:w="2160"/>
+          </w:tcPr>
+          <w:p>
+            <w:r>
+              <w:t>PSP123</w:t>
+            </w:r>
+          </w:p>
+        </w:tc>
+        <w:tc>
+          <w:tcPr>
+            <w:tcW w:type="dxa" w:w="2160"/>
+          </w:tcPr>
+          <w:p>
+            <w:r>
+              <w:t>79</w:t>
+            </w:r>
+          </w:p>
+        </w:tc>
+        <w:tc>
+          <w:tcPr>
+            <w:tcW w:type="dxa" w:w="2160"/>
+          </w:tcPr>
+          <w:p>
+            <w:r>
+              <w:t>77</w:t>
+            </w:r>
+          </w:p>
+        </w:tc>
+        <w:tc>
+          <w:tcPr>
+            <w:tcW w:type="dxa" w:w="2160"/>
+          </w:tcPr>
+          <w:p>
+            <w:r>
+              <w:t>2.5%</w:t>
+            </w:r>
+          </w:p>
+        </w:tc>
+      </w:tr>
+      <w:tr>
+        <w:tc>
+          <w:tcPr>
+            <w:tcW w:type="dxa" w:w="2160"/>
+          </w:tcPr>
+          <w:p>
+            <w:r>
+              <w:t>PSP148</w:t>
+            </w:r>
+          </w:p>
+        </w:tc>
+        <w:tc>
+          <w:tcPr>
+            <w:tcW w:type="dxa" w:w="2160"/>
+          </w:tcPr>
+          <w:p>
+            <w:r>
+              <w:t>29</w:t>
+            </w:r>
+          </w:p>
+        </w:tc>
+        <w:tc>
+          <w:tcPr>
+            <w:tcW w:type="dxa" w:w="2160"/>
+          </w:tcPr>
+          <w:p>
+            <w:r>
+              <w:t>27</w:t>
+            </w:r>
+          </w:p>
+        </w:tc>
+        <w:tc>
+          <w:tcPr>
+            <w:tcW w:type="dxa" w:w="2160"/>
+          </w:tcPr>
+          <w:p>
+            <w:r>
+              <w:t>6.9%</w:t>
+            </w:r>
+          </w:p>
+        </w:tc>
+      </w:tr>
+      <w:tr>
+        <w:tc>
+          <w:tcPr>
+            <w:tcW w:type="dxa" w:w="2160"/>
+          </w:tcPr>
+          <w:p>
+            <w:r>
+              <w:t>PSP172</w:t>
+            </w:r>
+          </w:p>
+        </w:tc>
+        <w:tc>
+          <w:tcPr>
+            <w:tcW w:type="dxa" w:w="2160"/>
+          </w:tcPr>
+          <w:p>
+            <w:r>
+              <w:t>32</w:t>
+            </w:r>
+          </w:p>
+        </w:tc>
+        <w:tc>
+          <w:tcPr>
+            <w:tcW w:type="dxa" w:w="2160"/>
+          </w:tcPr>
+          <w:p>
+            <w:r>
+              <w:t>28</w:t>
+            </w:r>
+          </w:p>
+        </w:tc>
+        <w:tc>
+          <w:tcPr>
+            <w:tcW w:type="dxa" w:w="2160"/>
+          </w:tcPr>
+          <w:p>
+            <w:r>
+              <w:t>12.5%</w:t>
+            </w:r>
+          </w:p>
+        </w:tc>
+      </w:tr>
+      <w:tr>
+        <w:tc>
+          <w:tcPr>
+            <w:tcW w:type="dxa" w:w="2160"/>
+          </w:tcPr>
+          <w:p>
+            <w:r>
+              <w:t>PSP197</w:t>
+            </w:r>
+          </w:p>
+        </w:tc>
+        <w:tc>
+          <w:tcPr>
+            <w:tcW w:type="dxa" w:w="2160"/>
+          </w:tcPr>
+          <w:p>
+            <w:r>
+              <w:t>89</w:t>
+            </w:r>
+          </w:p>
+        </w:tc>
+        <w:tc>
+          <w:tcPr>
+            <w:tcW w:type="dxa" w:w="2160"/>
+          </w:tcPr>
+          <w:p>
+            <w:r>
+              <w:t>89</w:t>
+            </w:r>
+          </w:p>
+        </w:tc>
+        <w:tc>
+          <w:tcPr>
+            <w:tcW w:type="dxa" w:w="2160"/>
+          </w:tcPr>
+          <w:p>
+            <w:r>
+              <w:t>0.0%</w:t>
+            </w:r>
+          </w:p>
+        </w:tc>
+      </w:tr>
+      <w:tr>
+        <w:tc>
+          <w:tcPr>
+            <w:tcW w:type="dxa" w:w="2160"/>
+          </w:tcPr>
+          <w:p>
+            <w:r>
+              <w:t>PSP220</w:t>
+            </w:r>
+          </w:p>
+        </w:tc>
+        <w:tc>
+          <w:tcPr>
+            <w:tcW w:type="dxa" w:w="2160"/>
+          </w:tcPr>
+          <w:p>
+            <w:r>
+              <w:t>113</w:t>
+            </w:r>
+          </w:p>
+        </w:tc>
+        <w:tc>
+          <w:tcPr>
+            <w:tcW w:type="dxa" w:w="2160"/>
+          </w:tcPr>
+          <w:p>
+            <w:r>
+              <w:t>112</w:t>
+            </w:r>
+          </w:p>
+        </w:tc>
+        <w:tc>
+          <w:tcPr>
+            <w:tcW w:type="dxa" w:w="2160"/>
+          </w:tcPr>
+          <w:p>
+            <w:r>
+              <w:t>0.9%</w:t>
+            </w:r>
+          </w:p>
+        </w:tc>
+      </w:tr>
+      <w:tr>
+        <w:tc>
+          <w:tcPr>
+            <w:tcW w:type="dxa" w:w="2160"/>
+          </w:tcPr>
+          <w:p>
+            <w:r>
+              <w:t>PSP245</w:t>
+            </w:r>
+          </w:p>
+        </w:tc>
+        <w:tc>
+          <w:tcPr>
+            <w:tcW w:type="dxa" w:w="2160"/>
+          </w:tcPr>
+          <w:p>
+            <w:r>
+              <w:t>45</w:t>
             </w:r>
           </w:p>
         </w:tc>
@@ -1593,129 +1927,13 @@
             </w:r>
           </w:p>
         </w:tc>
-      </w:tr>
-      <w:tr>
         <w:tc>
           <w:tcPr>
             <w:tcW w:type="dxa" w:w="2160"/>
           </w:tcPr>
           <w:p>
             <w:r>
-              <w:t>PSP100</w:t>
-            </w:r>
-          </w:p>
-        </w:tc>
-        <w:tc>
-          <w:tcPr>
-            <w:tcW w:type="dxa" w:w="2160"/>
-          </w:tcPr>
-          <w:p>
-            <w:r>
-              <w:t>56</w:t>
-            </w:r>
-          </w:p>
-        </w:tc>
-        <w:tc>
-          <w:tcPr>
-            <w:tcW w:type="dxa" w:w="2160"/>
-          </w:tcPr>
-          <w:p>
-            <w:r>
-              <w:t>54</w:t>
-            </w:r>
-          </w:p>
-        </w:tc>
-        <w:tc>
-          <w:tcPr>
-            <w:tcW w:type="dxa" w:w="2160"/>
-          </w:tcPr>
-          <w:p>
-            <w:r>
-              <w:t>53</w:t>
-            </w:r>
-          </w:p>
-        </w:tc>
-      </w:tr>
-      <w:tr>
-        <w:tc>
-          <w:tcPr>
-            <w:tcW w:type="dxa" w:w="2160"/>
-          </w:tcPr>
-          <w:p>
-            <w:r>
-              <w:t>PSP150</w:t>
-            </w:r>
-          </w:p>
-        </w:tc>
-        <w:tc>
-          <w:tcPr>
-            <w:tcW w:type="dxa" w:w="2160"/>
-          </w:tcPr>
-          <w:p>
-            <w:r>
-              <w:t>39</w:t>
-            </w:r>
-          </w:p>
-        </w:tc>
-        <w:tc>
-          <w:tcPr>
-            <w:tcW w:type="dxa" w:w="2160"/>
-          </w:tcPr>
-          <w:p>
-            <w:r>
-              <w:t>37</w:t>
-            </w:r>
-          </w:p>
-        </w:tc>
-        <w:tc>
-          <w:tcPr>
-            <w:tcW w:type="dxa" w:w="2160"/>
-          </w:tcPr>
-          <w:p>
-            <w:r>
-              <w:t>35</w:t>
-            </w:r>
-          </w:p>
-        </w:tc>
-      </w:tr>
-      <w:tr>
-        <w:tc>
-          <w:tcPr>
-            <w:tcW w:type="dxa" w:w="2160"/>
-          </w:tcPr>
-          <w:p>
-            <w:r>
-              <w:t>PSP200</w:t>
-            </w:r>
-          </w:p>
-        </w:tc>
-        <w:tc>
-          <w:tcPr>
-            <w:tcW w:type="dxa" w:w="2160"/>
-          </w:tcPr>
-          <w:p>
-            <w:r>
-              <w:t>55</w:t>
-            </w:r>
-          </w:p>
-        </w:tc>
-        <w:tc>
-          <w:tcPr>
-            <w:tcW w:type="dxa" w:w="2160"/>
-          </w:tcPr>
-          <w:p>
-            <w:r>
-              <w:t>51</w:t>
-            </w:r>
-          </w:p>
-        </w:tc>
-        <w:tc>
-          <w:tcPr>
-            <w:tcW w:type="dxa" w:w="2160"/>
-          </w:tcPr>
-          <w:p>
-            <w:r>
-              <w:t>48</w:t>
+              <w:t>8.9%</w:t>
             </w:r>
           </w:p>
         </w:tc>
@@ -1724,7 +1942,7 @@
     <w:p/>
     <w:p>
       <w:r>
-        <w:t>The GA shows consistent improvement with more time. At 5 seconds per instance, improvements range from 5% to 17% over the baseline. With the full 28-second budget available for single-instance grading, further improvements are expected.</w:t>
+        <w:t>With the full 28-second budget on J20, the GA improved 9 out of 10 instances, with improvements up to 18.5% (PSP1). Average improvement was 5.5%. J10 showed less improvement (2.7% average, 3 out of 9 feasible instances improved) because with only 10 activities, the priority rules already find near-optimal orderings and the search space is too small for the GA to add significant value.</w:t>
       </w:r>
     </w:p>
     <w:p>
@@ -1874,7 +2092,7 @@
     </w:p>
     <w:p>
       <w:r>
-        <w:t>We developed a solver for the Resource-Constrained Project Scheduling Problem that combines priority-rule heuristics, a Genetic Algorithm, and Forward-Backward Improvement. The solver achieves 100% validity on all feasible benchmark instances and produces schedules 3–6% better than the priority-rule baseline within a 0.15-second time budget, with improvements of up to 17% when given the full 28-second budget.</w:t>
+        <w:t>We developed a solver for the Resource-Constrained Project Scheduling Problem that combines priority-rule heuristics, a Genetic Algorithm, and Forward-Backward Improvement. The solver achieves 100% validity on all feasible benchmark instances and produces schedules 3.5–6.4% better than the priority-rule baseline in batch mode (0.2s), with improvements of up to 18.5% when given the full 28-second budget.</w:t>
       </w:r>
     </w:p>
     <w:p>

</xml_diff>